<commit_message>
Evaluación Final: Ejercicio 1 con dataset real de Kaggle (Global Superstore)
Se rehace el Ejercicio 1 sobre un dataset público de Kaggle (Global
Superstore, 1.000 pedidos) tal como pide la consigna: se separa la tabla
única en dos entidades (ventas + clientes por Customer ID), se limpia y
tipa la fecha, y se ejecuta la consulta de los últimos 30 días ordenada
descendente (40 filas, hasta 2015-12-31). Nueva captura del resultado.

El resto del reporte integrador sigue sobre RetailPro. Incluye el CSV,
el script de separación/consulta y la actualización del SQL y el README.

Co-Authored-By: Claude Opus 4.8 <noreply@anthropic.com>
Claude-Session: https://claude.ai/code/session_01KQLJUaduBhm2dGuTGD3cTx
</commit_message>
<xml_diff>
--- a/evaluacion-final-retailpro/Murphy_Lleyton_Evaluacion_Final_RetailPro.docx
+++ b/evaluacion-final-retailpro/Murphy_Lleyton_Evaluacion_Final_RetailPro.docx
@@ -1596,7 +1596,25 @@
           <w:sz w:val="21"/>
           <w:szCs w:val="21"/>
         </w:rPr>
-        <w:t xml:space="preserve">Consigna: extraer </w:t>
+        <w:t xml:space="preserve">Consigna: sobre un </w:t>
+      </w:r>
+      <w:r>
+        <w:rPr>
+          <w:b/>
+          <w:bCs/>
+          <w:color w:val="3F3F3F"/>
+          <w:sz w:val="21"/>
+          <w:szCs w:val="21"/>
+        </w:rPr>
+        <w:t xml:space="preserve">dataset real de Kaggle</w:t>
+      </w:r>
+      <w:r>
+        <w:rPr>
+          <w:color w:val="3F3F3F"/>
+          <w:sz w:val="21"/>
+          <w:szCs w:val="21"/>
+        </w:rPr>
+        <w:t xml:space="preserve"> con ventas y clientes, extraer </w:t>
       </w:r>
       <w:r>
         <w:rPr>
@@ -1614,9 +1632,398 @@
           <w:sz w:val="21"/>
           <w:szCs w:val="21"/>
         </w:rPr>
-        <w:t xml:space="preserve">, filtrar las ventas de los últimos 30 días (contados desde la última venta del dataset) y ordenar por fecha descendente.</w:t>
-      </w:r>
-    </w:p>
+        <w:t xml:space="preserve">, filtrar las ventas de los últimos 30 días (contados desde la última venta) y ordenar por fecha descendente.</w:t>
+      </w:r>
+    </w:p>
+    <w:p>
+      <w:pPr>
+        <w:spacing w:after="120" w:line="268"/>
+      </w:pPr>
+      <w:r>
+        <w:rPr>
+          <w:b/>
+          <w:bCs/>
+          <w:color w:val="1F3864"/>
+          <w:sz w:val="21"/>
+          <w:szCs w:val="21"/>
+        </w:rPr>
+        <w:t xml:space="preserve">Dataset elegido: </w:t>
+      </w:r>
+      <w:r>
+        <w:rPr>
+          <w:color w:val="3F3F3F"/>
+          <w:sz w:val="21"/>
+          <w:szCs w:val="21"/>
+        </w:rPr>
+        <w:t xml:space="preserve">«Global Superstore» (Kaggle) — retail global de tecnología, muebles y suministros de oficina. Viene en </w:t>
+      </w:r>
+      <w:r>
+        <w:rPr>
+          <w:i/>
+          <w:iCs/>
+          <w:color w:val="3F3F3F"/>
+          <w:sz w:val="21"/>
+          <w:szCs w:val="21"/>
+        </w:rPr>
+        <w:t xml:space="preserve">una sola tabla</w:t>
+      </w:r>
+      <w:r>
+        <w:rPr>
+          <w:color w:val="3F3F3F"/>
+          <w:sz w:val="21"/>
+          <w:szCs w:val="21"/>
+        </w:rPr>
+        <w:t xml:space="preserve">, por lo que se separa en las dos entidades que pide la consigna: </w:t>
+      </w:r>
+      <w:r>
+        <w:rPr>
+          <w:b/>
+          <w:bCs/>
+          <w:color w:val="3F3F3F"/>
+          <w:sz w:val="21"/>
+          <w:szCs w:val="21"/>
+        </w:rPr>
+        <w:t xml:space="preserve">ventas</w:t>
+      </w:r>
+      <w:r>
+        <w:rPr>
+          <w:color w:val="3F3F3F"/>
+          <w:sz w:val="21"/>
+          <w:szCs w:val="21"/>
+        </w:rPr>
+        <w:t xml:space="preserve"> y </w:t>
+      </w:r>
+      <w:r>
+        <w:rPr>
+          <w:b/>
+          <w:bCs/>
+          <w:color w:val="3F3F3F"/>
+          <w:sz w:val="21"/>
+          <w:szCs w:val="21"/>
+        </w:rPr>
+        <w:t xml:space="preserve">clientes</w:t>
+      </w:r>
+      <w:r>
+        <w:rPr>
+          <w:color w:val="3F3F3F"/>
+          <w:sz w:val="21"/>
+          <w:szCs w:val="21"/>
+        </w:rPr>
+        <w:t xml:space="preserve">.</w:t>
+      </w:r>
+    </w:p>
+    <w:p>
+      <w:pPr>
+        <w:pStyle w:val="Heading3"/>
+        <w:spacing w:after="80" w:before="180"/>
+      </w:pPr>
+      <w:r>
+        <w:rPr>
+          <w:b/>
+          <w:bCs/>
+          <w:color w:val="1F3864"/>
+          <w:sz w:val="22"/>
+          <w:szCs w:val="22"/>
+        </w:rPr>
+        <w:t xml:space="preserve">Preparación de datos</w:t>
+      </w:r>
+    </w:p>
+    <w:tbl>
+      <w:tblPr>
+        <w:tblW w:type="dxa" w:w="6000"/>
+        <w:tblBorders>
+          <w:top w:val="single" w:color="BFBFBF" w:sz="2"/>
+          <w:left w:val="single" w:color="BFBFBF" w:sz="2"/>
+          <w:bottom w:val="single" w:color="BFBFBF" w:sz="2"/>
+          <w:right w:val="single" w:color="BFBFBF" w:sz="2"/>
+          <w:insideH w:val="single" w:color="D9D9D9" w:sz="1"/>
+          <w:insideV w:val="single" w:color="D9D9D9" w:sz="1"/>
+        </w:tblBorders>
+      </w:tblPr>
+      <w:tblGrid>
+        <w:gridCol w:w="1700"/>
+        <w:gridCol w:w="4300"/>
+      </w:tblGrid>
+      <w:tr>
+        <w:trPr>
+          <w:tblHeader/>
+        </w:trPr>
+        <w:tc>
+          <w:tcPr>
+            <w:tcW w:type="dxa" w:w="1700"/>
+            <w:shd w:fill="1F3864" w:color="auto" w:val="clear"/>
+            <w:tcMar>
+              <w:top w:type="dxa" w:w="50"/>
+              <w:left w:type="dxa" w:w="90"/>
+              <w:bottom w:type="dxa" w:w="50"/>
+              <w:right w:type="dxa" w:w="90"/>
+            </w:tcMar>
+          </w:tcPr>
+          <w:p>
+            <w:pPr>
+              <w:jc w:val="center"/>
+            </w:pPr>
+            <w:r>
+              <w:rPr>
+                <w:b/>
+                <w:bCs/>
+                <w:color w:val="FFFFFF"/>
+                <w:sz w:val="19"/>
+                <w:szCs w:val="19"/>
+              </w:rPr>
+              <w:t xml:space="preserve">Paso</w:t>
+            </w:r>
+          </w:p>
+        </w:tc>
+        <w:tc>
+          <w:tcPr>
+            <w:tcW w:type="dxa" w:w="4300"/>
+            <w:shd w:fill="1F3864" w:color="auto" w:val="clear"/>
+            <w:tcMar>
+              <w:top w:type="dxa" w:w="50"/>
+              <w:left w:type="dxa" w:w="90"/>
+              <w:bottom w:type="dxa" w:w="50"/>
+              <w:right w:type="dxa" w:w="90"/>
+            </w:tcMar>
+          </w:tcPr>
+          <w:p>
+            <w:pPr>
+              <w:jc w:val="center"/>
+            </w:pPr>
+            <w:r>
+              <w:rPr>
+                <w:b/>
+                <w:bCs/>
+                <w:color w:val="FFFFFF"/>
+                <w:sz w:val="19"/>
+                <w:szCs w:val="19"/>
+              </w:rPr>
+              <w:t xml:space="preserve">Detalle</w:t>
+            </w:r>
+          </w:p>
+        </w:tc>
+      </w:tr>
+      <w:tr>
+        <w:tc>
+          <w:tcPr>
+            <w:tcW w:type="dxa" w:w="1700"/>
+            <w:tcMar>
+              <w:top w:type="dxa" w:w="50"/>
+              <w:left w:type="dxa" w:w="90"/>
+              <w:bottom w:type="dxa" w:w="50"/>
+              <w:right w:type="dxa" w:w="90"/>
+            </w:tcMar>
+          </w:tcPr>
+          <w:p>
+            <w:pPr>
+              <w:jc w:val="left"/>
+            </w:pPr>
+            <w:r>
+              <w:rPr>
+                <w:b/>
+                <w:bCs/>
+                <w:color w:val="3F3F3F"/>
+                <w:sz w:val="19"/>
+                <w:szCs w:val="19"/>
+              </w:rPr>
+              <w:t xml:space="preserve">Fuente</w:t>
+            </w:r>
+          </w:p>
+        </w:tc>
+        <w:tc>
+          <w:tcPr>
+            <w:tcW w:type="dxa" w:w="4300"/>
+            <w:tcMar>
+              <w:top w:type="dxa" w:w="50"/>
+              <w:left w:type="dxa" w:w="90"/>
+              <w:bottom w:type="dxa" w:w="50"/>
+              <w:right w:type="dxa" w:w="90"/>
+            </w:tcMar>
+          </w:tcPr>
+          <w:p>
+            <w:pPr>
+              <w:jc w:val="left"/>
+            </w:pPr>
+            <w:r>
+              <w:rPr>
+                <w:b w:val="false"/>
+                <w:bCs w:val="false"/>
+                <w:color w:val="3F3F3F"/>
+                <w:sz w:val="19"/>
+                <w:szCs w:val="19"/>
+              </w:rPr>
+              <w:t xml:space="preserve">Kaggle — Global Superstore (1.000 filas de pedidos)</w:t>
+            </w:r>
+          </w:p>
+        </w:tc>
+      </w:tr>
+      <w:tr>
+        <w:tc>
+          <w:tcPr>
+            <w:tcW w:type="dxa" w:w="1700"/>
+            <w:shd w:fill="F2F6FB" w:color="auto" w:val="clear"/>
+            <w:tcMar>
+              <w:top w:type="dxa" w:w="50"/>
+              <w:left w:type="dxa" w:w="90"/>
+              <w:bottom w:type="dxa" w:w="50"/>
+              <w:right w:type="dxa" w:w="90"/>
+            </w:tcMar>
+          </w:tcPr>
+          <w:p>
+            <w:pPr>
+              <w:jc w:val="left"/>
+            </w:pPr>
+            <w:r>
+              <w:rPr>
+                <w:b/>
+                <w:bCs/>
+                <w:color w:val="3F3F3F"/>
+                <w:sz w:val="19"/>
+                <w:szCs w:val="19"/>
+              </w:rPr>
+              <w:t xml:space="preserve">Separación en 2 tablas</w:t>
+            </w:r>
+          </w:p>
+        </w:tc>
+        <w:tc>
+          <w:tcPr>
+            <w:tcW w:type="dxa" w:w="4300"/>
+            <w:shd w:fill="F2F6FB" w:color="auto" w:val="clear"/>
+            <w:tcMar>
+              <w:top w:type="dxa" w:w="50"/>
+              <w:left w:type="dxa" w:w="90"/>
+              <w:bottom w:type="dxa" w:w="50"/>
+              <w:right w:type="dxa" w:w="90"/>
+            </w:tcMar>
+          </w:tcPr>
+          <w:p>
+            <w:pPr>
+              <w:jc w:val="left"/>
+            </w:pPr>
+            <w:r>
+              <w:rPr>
+                <w:b w:val="false"/>
+                <w:bCs w:val="false"/>
+                <w:color w:val="3F3F3F"/>
+                <w:sz w:val="19"/>
+                <w:szCs w:val="19"/>
+              </w:rPr>
+              <w:t xml:space="preserve">clientes (por Customer ID, 800 únicos) + ventas (1.000 líneas)</w:t>
+            </w:r>
+          </w:p>
+        </w:tc>
+      </w:tr>
+      <w:tr>
+        <w:tc>
+          <w:tcPr>
+            <w:tcW w:type="dxa" w:w="1700"/>
+            <w:tcMar>
+              <w:top w:type="dxa" w:w="50"/>
+              <w:left w:type="dxa" w:w="90"/>
+              <w:bottom w:type="dxa" w:w="50"/>
+              <w:right w:type="dxa" w:w="90"/>
+            </w:tcMar>
+          </w:tcPr>
+          <w:p>
+            <w:pPr>
+              <w:jc w:val="left"/>
+            </w:pPr>
+            <w:r>
+              <w:rPr>
+                <w:b/>
+                <w:bCs/>
+                <w:color w:val="3F3F3F"/>
+                <w:sz w:val="19"/>
+                <w:szCs w:val="19"/>
+              </w:rPr>
+              <w:t xml:space="preserve">Limpieza</w:t>
+            </w:r>
+          </w:p>
+        </w:tc>
+        <w:tc>
+          <w:tcPr>
+            <w:tcW w:type="dxa" w:w="4300"/>
+            <w:tcMar>
+              <w:top w:type="dxa" w:w="50"/>
+              <w:left w:type="dxa" w:w="90"/>
+              <w:bottom w:type="dxa" w:w="50"/>
+              <w:right w:type="dxa" w:w="90"/>
+            </w:tcMar>
+          </w:tcPr>
+          <w:p>
+            <w:pPr>
+              <w:jc w:val="left"/>
+            </w:pPr>
+            <w:r>
+              <w:rPr>
+                <w:b w:val="false"/>
+                <w:bCs w:val="false"/>
+                <w:color w:val="3F3F3F"/>
+                <w:sz w:val="19"/>
+                <w:szCs w:val="19"/>
+              </w:rPr>
+              <w:t xml:space="preserve">Order Date → tipo Date; conservar solo cliente, fecha y total; 0 filas con nulos críticos descartadas</w:t>
+            </w:r>
+          </w:p>
+        </w:tc>
+      </w:tr>
+      <w:tr>
+        <w:tc>
+          <w:tcPr>
+            <w:tcW w:type="dxa" w:w="1700"/>
+            <w:shd w:fill="F2F6FB" w:color="auto" w:val="clear"/>
+            <w:tcMar>
+              <w:top w:type="dxa" w:w="50"/>
+              <w:left w:type="dxa" w:w="90"/>
+              <w:bottom w:type="dxa" w:w="50"/>
+              <w:right w:type="dxa" w:w="90"/>
+            </w:tcMar>
+          </w:tcPr>
+          <w:p>
+            <w:pPr>
+              <w:jc w:val="left"/>
+            </w:pPr>
+            <w:r>
+              <w:rPr>
+                <w:b/>
+                <w:bCs/>
+                <w:color w:val="3F3F3F"/>
+                <w:sz w:val="19"/>
+                <w:szCs w:val="19"/>
+              </w:rPr>
+              <w:t xml:space="preserve">Columnas conservadas</w:t>
+            </w:r>
+          </w:p>
+        </w:tc>
+        <w:tc>
+          <w:tcPr>
+            <w:tcW w:type="dxa" w:w="4300"/>
+            <w:shd w:fill="F2F6FB" w:color="auto" w:val="clear"/>
+            <w:tcMar>
+              <w:top w:type="dxa" w:w="50"/>
+              <w:left w:type="dxa" w:w="90"/>
+              <w:bottom w:type="dxa" w:w="50"/>
+              <w:right w:type="dxa" w:w="90"/>
+            </w:tcMar>
+          </w:tcPr>
+          <w:p>
+            <w:pPr>
+              <w:jc w:val="left"/>
+            </w:pPr>
+            <w:r>
+              <w:rPr>
+                <w:b w:val="false"/>
+                <w:bCs w:val="false"/>
+                <w:color w:val="3F3F3F"/>
+                <w:sz w:val="19"/>
+                <w:szCs w:val="19"/>
+              </w:rPr>
+              <w:t xml:space="preserve">nombre_cliente · fecha_compra · total_venta (Sales)</w:t>
+            </w:r>
+          </w:p>
+        </w:tc>
+      </w:tr>
+    </w:tbl>
     <w:p>
       <w:pPr>
         <w:spacing w:after="40" w:before="60"/>
@@ -1625,7 +2032,7 @@
       <w:r>
         <w:drawing>
           <wp:inline distT="0" distB="0" distL="0" distR="0">
-            <wp:extent cx="5715000" cy="3038475"/>
+            <wp:extent cx="5619750" cy="3667125"/>
             <wp:effectExtent t="0" r="0" b="0" l="0"/>
             <wp:docPr id="1" name="" descr="" title=""/>
             <wp:cNvGraphicFramePr>
@@ -1650,7 +2057,7 @@
                   <pic:spPr bwMode="auto">
                     <a:xfrm>
                       <a:off x="0" y="0"/>
-                      <a:ext cx="5715000" cy="3038475"/>
+                      <a:ext cx="5619750" cy="3667125"/>
                     </a:xfrm>
                     <a:prstGeom prst="rect">
                       <a:avLst/>
@@ -1676,7 +2083,7 @@
           <w:sz w:val="17"/>
           <w:szCs w:val="17"/>
         </w:rPr>
-        <w:t xml:space="preserve">Figura 1. Consulta ejecutada y su resultado real (3 filas). Ventana: 2024-10-09 a 2024-11-08.</w:t>
+        <w:t xml:space="preserve">Figura 1. Consulta ejecutada sobre Global Superstore (Kaggle). 40 ventas en los últimos 30 días (hasta 2015-12-31); se muestran las 10 primeras.</w:t>
       </w:r>
     </w:p>
     <w:p>
@@ -1712,15 +2119,15 @@
           <w:sz w:val="21"/>
           <w:szCs w:val="21"/>
         </w:rPr>
-        <w:t xml:space="preserve">ventas (v) — tabla de hechos: </w:t>
-      </w:r>
-      <w:r>
-        <w:rPr>
-          <w:color w:val="3F3F3F"/>
-          <w:sz w:val="21"/>
-          <w:szCs w:val="21"/>
-        </w:rPr>
-        <w:t xml:space="preserve">aporta fecha_venta y total_venta (la métrica), y la clave id_cliente para el vínculo.</w:t>
+        <w:t xml:space="preserve">ventas (v) — hechos derivados: </w:t>
+      </w:r>
+      <w:r>
+        <w:rPr>
+          <w:color w:val="3F3F3F"/>
+          <w:sz w:val="21"/>
+          <w:szCs w:val="21"/>
+        </w:rPr>
+        <w:t xml:space="preserve">aporta fecha_compra y total_venta (= Sales, la métrica) y la clave id_cliente para el vínculo.</w:t>
       </w:r>
     </w:p>
     <w:p>
@@ -1740,15 +2147,15 @@
           <w:sz w:val="21"/>
           <w:szCs w:val="21"/>
         </w:rPr>
-        <w:t xml:space="preserve">clientes (c) — tabla dimensión: </w:t>
-      </w:r>
-      <w:r>
-        <w:rPr>
-          <w:color w:val="3F3F3F"/>
-          <w:sz w:val="21"/>
-          <w:szCs w:val="21"/>
-        </w:rPr>
-        <w:t xml:space="preserve">aporta nombre_cliente. Cumple el requisito de al menos dos entidades (ventas + clientes).</w:t>
+        <w:t xml:space="preserve">clientes (c) — dimensión derivada: </w:t>
+      </w:r>
+      <w:r>
+        <w:rPr>
+          <w:color w:val="3F3F3F"/>
+          <w:sz w:val="21"/>
+          <w:szCs w:val="21"/>
+        </w:rPr>
+        <w:t xml:space="preserve">una fila por Customer ID (nombre, segmento, ciudad, país). Separar la tabla única en estas dos entidades es lo que exige la consigna.</w:t>
       </w:r>
     </w:p>
     <w:p>
@@ -1804,7 +2211,7 @@
           <w:sz w:val="21"/>
           <w:szCs w:val="21"/>
         </w:rPr>
-        <w:t xml:space="preserve">se toma MAX(fecha_venta) como «hoy» del dataset (08/11/2024) y se restan 30 días con DATEADD (SQL Server) / date(...,'-30 day') (SQLite). Así el filtro es reproducible aunque cambien los datos.</w:t>
+        <w:t xml:space="preserve">se toma MAX(fecha_compra) como «hoy» del dataset (31/12/2015) y se restan 30 días con DATEADD (SQL Server) / date(...,'-30 day') (SQLite). El filtro es reproducible aunque cambien los datos.</w:t>
       </w:r>
     </w:p>
     <w:p>
@@ -1824,7 +2231,7 @@
           <w:sz w:val="21"/>
           <w:szCs w:val="21"/>
         </w:rPr>
-        <w:t xml:space="preserve">ORDER BY fecha_venta DESC: </w:t>
+        <w:t xml:space="preserve">ORDER BY fecha_compra DESC: </w:t>
       </w:r>
       <w:r>
         <w:rPr>
@@ -1855,7 +2262,30 @@
           <w:sz w:val="21"/>
           <w:szCs w:val="21"/>
         </w:rPr>
-        <w:t xml:space="preserve">son las columnas mínimas del enunciado (cliente, fecha, total) y provienen de las dos entidades naturales del negocio; la fecha está tipada como Date, lo que habilita el filtro temporal.</w:t>
+        <w:t xml:space="preserve">cliente, fecha y total son exactamente las columnas mínimas del enunciado; la fecha se tipó como Date para habilitar el filtro temporal, y se derivaron las dos entidades ventas + clientes a partir de la tabla original.</w:t>
+      </w:r>
+    </w:p>
+    <w:p>
+      <w:pPr>
+        <w:spacing w:after="120" w:line="268"/>
+      </w:pPr>
+      <w:r>
+        <w:rPr>
+          <w:b/>
+          <w:bCs/>
+          <w:color w:val="1F3864"/>
+          <w:sz w:val="18"/>
+          <w:szCs w:val="18"/>
+        </w:rPr>
+        <w:t xml:space="preserve">Nota de alcance. </w:t>
+      </w:r>
+      <w:r>
+        <w:rPr>
+          <w:color w:val="3F3F3F"/>
+          <w:sz w:val="18"/>
+          <w:szCs w:val="18"/>
+        </w:rPr>
+        <w:t xml:space="preserve">El Ejercicio 1 usa este dataset de Kaggle tal como pide la consigna. El resto del trabajo (Ejercicios 2 y 3 y el reporte integrador de la sección 3) se construye sobre el proyecto RetailPro, que consolida los módulos previos del programa.</w:t>
       </w:r>
     </w:p>
     <w:p>

</xml_diff>